<commit_message>
se arregla modelo por entidad faltante, se genera nuevo ddl
</commit_message>
<xml_diff>
--- a/Formato de Informe de Proyecto.docx
+++ b/Formato de Informe de Proyecto.docx
@@ -1,6 +1,6 @@
 
 <file path=word/document.xml><?xml version="1.0" encoding="utf-8"?>
-<w:document xmlns:wpc="http://schemas.microsoft.com/office/word/2010/wordprocessingCanvas" xmlns:cx="http://schemas.microsoft.com/office/drawing/2014/chartex" xmlns:cx1="http://schemas.microsoft.com/office/drawing/2015/9/8/chartex" xmlns:cx2="http://schemas.microsoft.com/office/drawing/2015/10/21/chartex" xmlns:cx3="http://schemas.microsoft.com/office/drawing/2016/5/9/chartex" xmlns:cx4="http://schemas.microsoft.com/office/drawing/2016/5/10/chartex" xmlns:cx5="http://schemas.microsoft.com/office/drawing/2016/5/11/chartex" xmlns:cx6="http://schemas.microsoft.com/office/drawing/2016/5/12/chartex" xmlns:cx7="http://schemas.microsoft.com/office/drawing/2016/5/13/chartex" xmlns:cx8="http://schemas.microsoft.com/office/drawing/2016/5/14/chartex" xmlns:mc="http://schemas.openxmlformats.org/markup-compatibility/2006" xmlns:m="http://schemas.openxmlformats.org/officeDocument/2006/math" xmlns:aink="http://schemas.microsoft.com/office/drawing/2016/ink" xmlns:am3d="http://schemas.microsoft.com/office/drawing/2017/model3d" xmlns:oel="http://schemas.microsoft.com/office/2019/extlst" xmlns:r="http://schemas.openxmlformats.org/officeDocument/2006/relationships" xmlns:wp14="http://schemas.microsoft.com/office/word/2010/wordprocessingDrawing" xmlns:wp="http://schemas.openxmlformats.org/drawingml/2006/wordprocessingDrawing" xmlns:wpg="http://schemas.microsoft.com/office/word/2010/wordprocessingGroup" xmlns:wpi="http://schemas.microsoft.com/office/word/2010/wordprocessingInk" xmlns:wps="http://schemas.microsoft.com/office/word/2010/wordprocessingShape" xmlns:o="urn:schemas-microsoft-com:office:office" xmlns:v="urn:schemas-microsoft-com:vml" xmlns:w10="urn:schemas-microsoft-com:office:word" xmlns:w="http://schemas.openxmlformats.org/wordprocessingml/2006/main" xmlns:w14="http://schemas.microsoft.com/office/word/2010/wordml" xmlns:w15="http://schemas.microsoft.com/office/word/2012/wordml" xmlns:w16cex="http://schemas.microsoft.com/office/word/2018/wordml/cex" xmlns:w16cid="http://schemas.microsoft.com/office/word/2016/wordml/cid" xmlns:w16="http://schemas.microsoft.com/office/word/2018/wordml" xmlns:w16sdtdh="http://schemas.microsoft.com/office/word/2020/wordml/sdtdatahash" xmlns:w16sdtfl="http://schemas.microsoft.com/office/word/2024/wordml/sdtformatlock" xmlns:w16se="http://schemas.microsoft.com/office/word/2015/wordml/symex" xmlns:w16du="http://schemas.microsoft.com/office/word/2023/wordml/word16du" xmlns:wne="http://schemas.microsoft.com/office/word/2006/wordml" mc:Ignorable="w14 w15 w16se w16cid w16 w16cex w16sdtdh w16sdtfl w16du wp14">
+<w:document xmlns:wpc="http://schemas.microsoft.com/office/word/2010/wordprocessingCanvas" xmlns:cx="http://schemas.microsoft.com/office/drawing/2014/chartex" xmlns:cx1="http://schemas.microsoft.com/office/drawing/2015/9/8/chartex" xmlns:cx2="http://schemas.microsoft.com/office/drawing/2015/10/21/chartex" xmlns:cx3="http://schemas.microsoft.com/office/drawing/2016/5/9/chartex" xmlns:cx4="http://schemas.microsoft.com/office/drawing/2016/5/10/chartex" xmlns:cx5="http://schemas.microsoft.com/office/drawing/2016/5/11/chartex" xmlns:cx6="http://schemas.microsoft.com/office/drawing/2016/5/12/chartex" xmlns:cx7="http://schemas.microsoft.com/office/drawing/2016/5/13/chartex" xmlns:cx8="http://schemas.microsoft.com/office/drawing/2016/5/14/chartex" xmlns:mc="http://schemas.openxmlformats.org/markup-compatibility/2006" xmlns:aink="http://schemas.microsoft.com/office/drawing/2016/ink" xmlns:am3d="http://schemas.microsoft.com/office/drawing/2017/model3d" xmlns:o="urn:schemas-microsoft-com:office:office" xmlns:oel="http://schemas.microsoft.com/office/2019/extlst" xmlns:r="http://schemas.openxmlformats.org/officeDocument/2006/relationships" xmlns:m="http://schemas.openxmlformats.org/officeDocument/2006/math" xmlns:v="urn:schemas-microsoft-com:vml" xmlns:wp14="http://schemas.microsoft.com/office/word/2010/wordprocessingDrawing" xmlns:wp="http://schemas.openxmlformats.org/drawingml/2006/wordprocessingDrawing" xmlns:w10="urn:schemas-microsoft-com:office:word" xmlns:w="http://schemas.openxmlformats.org/wordprocessingml/2006/main" xmlns:w14="http://schemas.microsoft.com/office/word/2010/wordml" xmlns:w15="http://schemas.microsoft.com/office/word/2012/wordml" xmlns:w16cex="http://schemas.microsoft.com/office/word/2018/wordml/cex" xmlns:w16cid="http://schemas.microsoft.com/office/word/2016/wordml/cid" xmlns:w16="http://schemas.microsoft.com/office/word/2018/wordml" xmlns:w16sdtdh="http://schemas.microsoft.com/office/word/2020/wordml/sdtdatahash" xmlns:w16se="http://schemas.microsoft.com/office/word/2015/wordml/symex" xmlns:wpg="http://schemas.microsoft.com/office/word/2010/wordprocessingGroup" xmlns:wpi="http://schemas.microsoft.com/office/word/2010/wordprocessingInk" xmlns:wne="http://schemas.microsoft.com/office/word/2006/wordml" xmlns:wps="http://schemas.microsoft.com/office/word/2010/wordprocessingShape" mc:Ignorable="w14 w15 w16se w16cid w16 w16cex w16sdtdh wp14">
   <w:body>
     <w:p>
       <w:pPr>
@@ -291,7 +291,23 @@
           <w:sz w:val="32"/>
           <w:szCs w:val="32"/>
         </w:rPr>
-        <w:t>Proyecto de título presentado al Instituto Profesional Duoc UC sede San Joaquín para optar la asignatura de Taller de Base de Datos.</w:t>
+        <w:t xml:space="preserve">Proyecto de título presentado al Instituto Profesional Duoc UC </w:t>
+      </w:r>
+      <w:r>
+        <w:rPr>
+          <w:color w:val="000000"/>
+          <w:sz w:val="32"/>
+          <w:szCs w:val="32"/>
+        </w:rPr>
+        <w:t>S</w:t>
+      </w:r>
+      <w:r>
+        <w:rPr>
+          <w:color w:val="000000"/>
+          <w:sz w:val="32"/>
+          <w:szCs w:val="32"/>
+        </w:rPr>
+        <w:t>ede San Joaquín para optar la asignatura de Taller de Base de Datos.</w:t>
       </w:r>
     </w:p>
     <w:p>
@@ -5068,6 +5084,44 @@
     </w:p>
     <w:p>
       <w:pPr>
+        <w:ind w:left="792"/>
+        <w:outlineLvl w:val="1"/>
+        <w:rPr>
+          <w:color w:val="000000"/>
+          <w:sz w:val="36"/>
+          <w:szCs w:val="36"/>
+        </w:rPr>
+      </w:pPr>
+    </w:p>
+    <w:p>
+      <w:pPr>
+        <w:ind w:left="792"/>
+        <w:outlineLvl w:val="1"/>
+        <w:rPr>
+          <w:b/>
+          <w:bCs/>
+          <w:i/>
+          <w:iCs/>
+          <w:color w:val="000000"/>
+          <w:sz w:val="32"/>
+          <w:szCs w:val="32"/>
+        </w:rPr>
+      </w:pPr>
+      <w:r>
+        <w:rPr>
+          <w:b/>
+          <w:bCs/>
+          <w:i/>
+          <w:iCs/>
+          <w:color w:val="000000"/>
+          <w:sz w:val="32"/>
+          <w:szCs w:val="32"/>
+        </w:rPr>
+        <w:t>FitManagerPro</w:t>
+      </w:r>
+    </w:p>
+    <w:p>
+      <w:pPr>
         <w:rPr>
           <w:color w:val="000000"/>
           <w:sz w:val="24"/>
@@ -5407,6 +5461,7 @@
           <w:sz w:val="24"/>
           <w:szCs w:val="24"/>
         </w:rPr>
+        <w:lastRenderedPageBreak/>
         <w:t>•  Controlar patologías y condiciones de salud de los clientes para prevenir riesgos.</w:t>
       </w:r>
     </w:p>
@@ -7578,25 +7633,7 @@
           <w:sz w:val="24"/>
           <w:szCs w:val="24"/>
         </w:rPr>
-        <w:t xml:space="preserve">El proyecto es técnicamente factible. Nuestro equipo de desarrollo cuenta con los conocimientos necesarios en modelamiento de bases de datos relacionales y gestión de repositorios (Git). No se requiere investigación en tecnologías experimentales, ya que el </w:t>
-      </w:r>
-      <w:proofErr w:type="spellStart"/>
-      <w:r>
-        <w:rPr>
-          <w:color w:val="000000"/>
-          <w:sz w:val="24"/>
-          <w:szCs w:val="24"/>
-        </w:rPr>
-        <w:t>stack</w:t>
-      </w:r>
-      <w:proofErr w:type="spellEnd"/>
-      <w:r>
-        <w:rPr>
-          <w:color w:val="000000"/>
-          <w:sz w:val="24"/>
-          <w:szCs w:val="24"/>
-        </w:rPr>
-        <w:t xml:space="preserve"> seleccionado está maduro y ampliamente documentado.  </w:t>
+        <w:t xml:space="preserve">El proyecto es técnicamente factible. Nuestro equipo de desarrollo cuenta con los conocimientos necesarios en modelamiento de bases de datos relacionales y gestión de repositorios (Git). No se requiere investigación en tecnologías experimentales, ya que el stack seleccionado está maduro y ampliamente documentado.  </w:t>
       </w:r>
     </w:p>
     <w:p>
@@ -8546,6 +8583,7 @@
                     <w:sz w:val="26"/>
                     <w:szCs w:val="26"/>
                   </w:rPr>
+                  <w:lastRenderedPageBreak/>
                   <w:t xml:space="preserve">Económica </w:t>
                 </w:r>
               </w:p>
@@ -10222,7 +10260,7 @@
 </file>
 
 <file path=word/numbering.xml><?xml version="1.0" encoding="utf-8"?>
-<w:numbering xmlns:wpc="http://schemas.microsoft.com/office/word/2010/wordprocessingCanvas" xmlns:cx="http://schemas.microsoft.com/office/drawing/2014/chartex" xmlns:cx1="http://schemas.microsoft.com/office/drawing/2015/9/8/chartex" xmlns:cx2="http://schemas.microsoft.com/office/drawing/2015/10/21/chartex" xmlns:cx3="http://schemas.microsoft.com/office/drawing/2016/5/9/chartex" xmlns:cx4="http://schemas.microsoft.com/office/drawing/2016/5/10/chartex" xmlns:cx5="http://schemas.microsoft.com/office/drawing/2016/5/11/chartex" xmlns:cx6="http://schemas.microsoft.com/office/drawing/2016/5/12/chartex" xmlns:cx7="http://schemas.microsoft.com/office/drawing/2016/5/13/chartex" xmlns:cx8="http://schemas.microsoft.com/office/drawing/2016/5/14/chartex" xmlns:mc="http://schemas.openxmlformats.org/markup-compatibility/2006" xmlns:m="http://schemas.openxmlformats.org/officeDocument/2006/math" xmlns:aink="http://schemas.microsoft.com/office/drawing/2016/ink" xmlns:am3d="http://schemas.microsoft.com/office/drawing/2017/model3d" xmlns:oel="http://schemas.microsoft.com/office/2019/extlst" xmlns:r="http://schemas.openxmlformats.org/officeDocument/2006/relationships" xmlns:wp14="http://schemas.microsoft.com/office/word/2010/wordprocessingDrawing" xmlns:wp="http://schemas.openxmlformats.org/drawingml/2006/wordprocessingDrawing" xmlns:wpg="http://schemas.microsoft.com/office/word/2010/wordprocessingGroup" xmlns:wpi="http://schemas.microsoft.com/office/word/2010/wordprocessingInk" xmlns:wps="http://schemas.microsoft.com/office/word/2010/wordprocessingShape" xmlns:o="urn:schemas-microsoft-com:office:office" xmlns:v="urn:schemas-microsoft-com:vml" xmlns:w10="urn:schemas-microsoft-com:office:word" xmlns:w="http://schemas.openxmlformats.org/wordprocessingml/2006/main" xmlns:w14="http://schemas.microsoft.com/office/word/2010/wordml" xmlns:w15="http://schemas.microsoft.com/office/word/2012/wordml" xmlns:w16cex="http://schemas.microsoft.com/office/word/2018/wordml/cex" xmlns:w16cid="http://schemas.microsoft.com/office/word/2016/wordml/cid" xmlns:w16="http://schemas.microsoft.com/office/word/2018/wordml" xmlns:w16sdtdh="http://schemas.microsoft.com/office/word/2020/wordml/sdtdatahash" xmlns:w16sdtfl="http://schemas.microsoft.com/office/word/2024/wordml/sdtformatlock" xmlns:w16se="http://schemas.microsoft.com/office/word/2015/wordml/symex" xmlns:w16du="http://schemas.microsoft.com/office/word/2023/wordml/word16du" xmlns:wne="http://schemas.microsoft.com/office/word/2006/wordml" mc:Ignorable="w14 w15 w16se w16cid w16 w16cex w16sdtdh w16sdtfl w16du wp14">
+<w:numbering xmlns:wpc="http://schemas.microsoft.com/office/word/2010/wordprocessingCanvas" xmlns:cx="http://schemas.microsoft.com/office/drawing/2014/chartex" xmlns:cx1="http://schemas.microsoft.com/office/drawing/2015/9/8/chartex" xmlns:cx2="http://schemas.microsoft.com/office/drawing/2015/10/21/chartex" xmlns:cx3="http://schemas.microsoft.com/office/drawing/2016/5/9/chartex" xmlns:cx4="http://schemas.microsoft.com/office/drawing/2016/5/10/chartex" xmlns:cx5="http://schemas.microsoft.com/office/drawing/2016/5/11/chartex" xmlns:cx6="http://schemas.microsoft.com/office/drawing/2016/5/12/chartex" xmlns:cx7="http://schemas.microsoft.com/office/drawing/2016/5/13/chartex" xmlns:cx8="http://schemas.microsoft.com/office/drawing/2016/5/14/chartex" xmlns:mc="http://schemas.openxmlformats.org/markup-compatibility/2006" xmlns:aink="http://schemas.microsoft.com/office/drawing/2016/ink" xmlns:am3d="http://schemas.microsoft.com/office/drawing/2017/model3d" xmlns:o="urn:schemas-microsoft-com:office:office" xmlns:oel="http://schemas.microsoft.com/office/2019/extlst" xmlns:r="http://schemas.openxmlformats.org/officeDocument/2006/relationships" xmlns:m="http://schemas.openxmlformats.org/officeDocument/2006/math" xmlns:v="urn:schemas-microsoft-com:vml" xmlns:wp14="http://schemas.microsoft.com/office/word/2010/wordprocessingDrawing" xmlns:wp="http://schemas.openxmlformats.org/drawingml/2006/wordprocessingDrawing" xmlns:w10="urn:schemas-microsoft-com:office:word" xmlns:w="http://schemas.openxmlformats.org/wordprocessingml/2006/main" xmlns:w14="http://schemas.microsoft.com/office/word/2010/wordml" xmlns:w15="http://schemas.microsoft.com/office/word/2012/wordml" xmlns:w16cex="http://schemas.microsoft.com/office/word/2018/wordml/cex" xmlns:w16cid="http://schemas.microsoft.com/office/word/2016/wordml/cid" xmlns:w16="http://schemas.microsoft.com/office/word/2018/wordml" xmlns:w16sdtdh="http://schemas.microsoft.com/office/word/2020/wordml/sdtdatahash" xmlns:w16se="http://schemas.microsoft.com/office/word/2015/wordml/symex" xmlns:wpg="http://schemas.microsoft.com/office/word/2010/wordprocessingGroup" xmlns:wpi="http://schemas.microsoft.com/office/word/2010/wordprocessingInk" xmlns:wne="http://schemas.microsoft.com/office/word/2006/wordml" xmlns:wps="http://schemas.microsoft.com/office/word/2010/wordprocessingShape" mc:Ignorable="w14 w15 w16se w16cid w16 w16cex w16sdtdh wp14">
   <w:abstractNum w:abstractNumId="0" w15:restartNumberingAfterBreak="0">
     <w:nsid w:val="02755FB0"/>
     <w:multiLevelType w:val="multilevel"/>
@@ -14588,7 +14626,7 @@
 </file>
 
 <file path=word/styles.xml><?xml version="1.0" encoding="utf-8"?>
-<w:styles xmlns:mc="http://schemas.openxmlformats.org/markup-compatibility/2006" xmlns:r="http://schemas.openxmlformats.org/officeDocument/2006/relationships" xmlns:w="http://schemas.openxmlformats.org/wordprocessingml/2006/main" xmlns:w14="http://schemas.microsoft.com/office/word/2010/wordml" xmlns:w15="http://schemas.microsoft.com/office/word/2012/wordml" xmlns:w16cex="http://schemas.microsoft.com/office/word/2018/wordml/cex" xmlns:w16cid="http://schemas.microsoft.com/office/word/2016/wordml/cid" xmlns:w16="http://schemas.microsoft.com/office/word/2018/wordml" xmlns:w16sdtdh="http://schemas.microsoft.com/office/word/2020/wordml/sdtdatahash" xmlns:w16sdtfl="http://schemas.microsoft.com/office/word/2024/wordml/sdtformatlock" xmlns:w16se="http://schemas.microsoft.com/office/word/2015/wordml/symex" xmlns:w16du="http://schemas.microsoft.com/office/word/2023/wordml/word16du" mc:Ignorable="w14 w15 w16se w16cid w16 w16cex w16sdtdh w16sdtfl w16du">
+<w:styles xmlns:mc="http://schemas.openxmlformats.org/markup-compatibility/2006" xmlns:r="http://schemas.openxmlformats.org/officeDocument/2006/relationships" xmlns:w="http://schemas.openxmlformats.org/wordprocessingml/2006/main" xmlns:w14="http://schemas.microsoft.com/office/word/2010/wordml" xmlns:w15="http://schemas.microsoft.com/office/word/2012/wordml" xmlns:w16cex="http://schemas.microsoft.com/office/word/2018/wordml/cex" xmlns:w16cid="http://schemas.microsoft.com/office/word/2016/wordml/cid" xmlns:w16="http://schemas.microsoft.com/office/word/2018/wordml" xmlns:w16sdtdh="http://schemas.microsoft.com/office/word/2020/wordml/sdtdatahash" xmlns:w16se="http://schemas.microsoft.com/office/word/2015/wordml/symex" mc:Ignorable="w14 w15 w16se w16cid w16 w16cex w16sdtdh">
   <w:docDefaults>
     <w:rPrDefault>
       <w:rPr>
@@ -15552,28 +15590,28 @@
 </file>
 
 <file path=customXml/item1.xml><?xml version="1.0" encoding="utf-8"?>
+<b:Sources xmlns:b="http://schemas.openxmlformats.org/officeDocument/2006/bibliography" xmlns="http://schemas.openxmlformats.org/officeDocument/2006/bibliography" SelectedStyle="/APASixthEditionOfficeOnline.xsl" StyleName="APA" Version="6"/>
+</file>
+
+<file path=customXml/item2.xml><?xml version="1.0" encoding="utf-8"?>
 <go:gDocsCustomXmlDataStorage xmlns:go="http://customooxmlschemas.google.com/" xmlns:r="http://schemas.openxmlformats.org/officeDocument/2006/relationships" uri="GoogleDocsCustomDataVersion2">
   <go:docsCustomData xmlns:go="http://customooxmlschemas.google.com/" roundtripDataSignature="AMtx7mjSSaOv5uH1xJKtCfnXJnfM71xJ9Q==">CgMxLjAaHwoBMBIaChgICVIUChJ0YWJsZS42dGFtcHZlZ3Q0dTAaHgoBMRIZChcICVITChF0YWJsZS50Y3Y5OXJpOWR0MDgAciExSEYzZlI0a3FiTktpcU43d3F2bU4yVGVISTVYMUdqSzc=</go:docsCustomData>
 </go:gDocsCustomXmlDataStorage>
 </file>
 
-<file path=customXml/item2.xml><?xml version="1.0" encoding="utf-8"?>
-<b:Sources xmlns:b="http://schemas.openxmlformats.org/officeDocument/2006/bibliography" xmlns="http://schemas.openxmlformats.org/officeDocument/2006/bibliography" SelectedStyle="/APASixthEditionOfficeOnline.xsl" StyleName="APA" Version="6"/>
+<file path=customXml/itemProps1.xml><?xml version="1.0" encoding="utf-8"?>
+<ds:datastoreItem xmlns:ds="http://schemas.openxmlformats.org/officeDocument/2006/customXml" ds:itemID="{ADE7FEF5-BB44-CA48-A392-6BEB793FAC7A}">
+  <ds:schemaRefs>
+    <ds:schemaRef ds:uri="http://schemas.openxmlformats.org/officeDocument/2006/bibliography"/>
+  </ds:schemaRefs>
+</ds:datastoreItem>
 </file>
 
-<file path=customXml/itemProps1.xml><?xml version="1.0" encoding="utf-8"?>
+<file path=customXml/itemProps2.xml><?xml version="1.0" encoding="utf-8"?>
 <ds:datastoreItem xmlns:ds="http://schemas.openxmlformats.org/officeDocument/2006/customXml" ds:itemID="{11111111-1234-1234-1234-123412341234}">
   <ds:schemaRefs>
     <ds:schemaRef ds:uri="http://customooxmlschemas.google.com/"/>
     <ds:schemaRef ds:uri="http://schemas.openxmlformats.org/officeDocument/2006/relationships"/>
   </ds:schemaRefs>
 </ds:datastoreItem>
-</file>
-
-<file path=customXml/itemProps2.xml><?xml version="1.0" encoding="utf-8"?>
-<ds:datastoreItem xmlns:ds="http://schemas.openxmlformats.org/officeDocument/2006/customXml" ds:itemID="{ADE7FEF5-BB44-CA48-A392-6BEB793FAC7A}">
-  <ds:schemaRefs>
-    <ds:schemaRef ds:uri="http://schemas.openxmlformats.org/officeDocument/2006/bibliography"/>
-  </ds:schemaRefs>
-</ds:datastoreItem>
 </file>
</xml_diff>